<commit_message>
feat: add phone column, fix contact extraction, map Q&A responses to DOCX report
- Dashboard: add phone column to assessment table
- Chat: fix designation extraction with positional fallback
- Chat: fix phone regex to require leading digit
- Send-report: extract Q&A pairs from messages table
- DOCX: map user answers to Section 2 Current Status/Input column
</commit_message>
<xml_diff>
--- a/EECA Compliance Readiness Preliminary Report.docx
+++ b/EECA Compliance Readiness Preliminary Report.docx
@@ -1,6 +1,6 @@
 
 <file path=word/document.xml><?xml version="1.0" encoding="utf-8"?>
-<w:document xmlns:wpc="http://schemas.microsoft.com/office/word/2010/wordprocessingCanvas" xmlns:cx="http://schemas.microsoft.com/office/drawing/2014/chartex" xmlns:cx1="http://schemas.microsoft.com/office/drawing/2015/9/8/chartex" xmlns:cx2="http://schemas.microsoft.com/office/drawing/2015/10/21/chartex" xmlns:cx3="http://schemas.microsoft.com/office/drawing/2016/5/9/chartex" xmlns:cx4="http://schemas.microsoft.com/office/drawing/2016/5/10/chartex" xmlns:cx5="http://schemas.microsoft.com/office/drawing/2016/5/11/chartex" xmlns:cx6="http://schemas.microsoft.com/office/drawing/2016/5/12/chartex" xmlns:cx7="http://schemas.microsoft.com/office/drawing/2016/5/13/chartex" xmlns:cx8="http://schemas.microsoft.com/office/drawing/2016/5/14/chartex" xmlns:mc="http://schemas.openxmlformats.org/markup-compatibility/2006" xmlns:aink="http://schemas.microsoft.com/office/drawing/2016/ink" xmlns:am3d="http://schemas.microsoft.com/office/drawing/2017/model3d" xmlns:o="urn:schemas-microsoft-com:office:office" xmlns:oel="http://schemas.microsoft.com/office/2019/extlst" xmlns:r="http://schemas.openxmlformats.org/officeDocument/2006/relationships" xmlns:m="http://schemas.openxmlformats.org/officeDocument/2006/math" xmlns:v="urn:schemas-microsoft-com:vml" xmlns:wp14="http://schemas.microsoft.com/office/word/2010/wordprocessingDrawing" xmlns:wp="http://schemas.openxmlformats.org/drawingml/2006/wordprocessingDrawing" xmlns:w10="urn:schemas-microsoft-com:office:word" xmlns:w="http://schemas.openxmlformats.org/wordprocessingml/2006/main" xmlns:w14="http://schemas.microsoft.com/office/word/2010/wordml" xmlns:w15="http://schemas.microsoft.com/office/word/2012/wordml" xmlns:w16cex="http://schemas.microsoft.com/office/word/2018/wordml/cex" xmlns:w16cid="http://schemas.microsoft.com/office/word/2016/wordml/cid" xmlns:w16="http://schemas.microsoft.com/office/word/2018/wordml" xmlns:w16du="http://schemas.microsoft.com/office/word/2023/wordml/word16du" xmlns:w16sdtdh="http://schemas.microsoft.com/office/word/2020/wordml/sdtdatahash" xmlns:w16sdtfl="http://schemas.microsoft.com/office/word/2024/wordml/sdtformatlock" xmlns:w16se="http://schemas.microsoft.com/office/word/2015/wordml/symex" xmlns:wpg="http://schemas.microsoft.com/office/word/2010/wordprocessingGroup" xmlns:wpi="http://schemas.microsoft.com/office/word/2010/wordprocessingInk" xmlns:wne="http://schemas.microsoft.com/office/word/2006/wordml" xmlns:wps="http://schemas.microsoft.com/office/word/2010/wordprocessingShape" mc:Ignorable="w14 w15 w16se w16cid w16 w16cex w16sdtdh w16sdtfl w16du wp14">
+<w:document xmlns:wpc="http://schemas.microsoft.com/office/word/2010/wordprocessingCanvas" xmlns:cx="http://schemas.microsoft.com/office/drawing/2014/chartex" xmlns:cx1="http://schemas.microsoft.com/office/drawing/2015/9/8/chartex" xmlns:cx2="http://schemas.microsoft.com/office/drawing/2015/10/21/chartex" xmlns:cx3="http://schemas.microsoft.com/office/drawing/2016/5/9/chartex" xmlns:cx4="http://schemas.microsoft.com/office/drawing/2016/5/10/chartex" xmlns:cx5="http://schemas.microsoft.com/office/drawing/2016/5/11/chartex" xmlns:cx6="http://schemas.microsoft.com/office/drawing/2016/5/12/chartex" xmlns:cx7="http://schemas.microsoft.com/office/drawing/2016/5/13/chartex" xmlns:cx8="http://schemas.microsoft.com/office/drawing/2016/5/14/chartex" xmlns:mc="http://schemas.openxmlformats.org/markup-compatibility/2006" xmlns:aink="http://schemas.microsoft.com/office/drawing/2016/ink" xmlns:am3d="http://schemas.microsoft.com/office/drawing/2017/model3d" xmlns:o="urn:schemas-microsoft-com:office:office" xmlns:r="http://schemas.openxmlformats.org/officeDocument/2006/relationships" xmlns:m="http://schemas.openxmlformats.org/officeDocument/2006/math" xmlns:v="urn:schemas-microsoft-com:vml" xmlns:wp14="http://schemas.microsoft.com/office/word/2010/wordprocessingDrawing" xmlns:wp="http://schemas.openxmlformats.org/drawingml/2006/wordprocessingDrawing" xmlns:w10="urn:schemas-microsoft-com:office:word" xmlns:w="http://schemas.openxmlformats.org/wordprocessingml/2006/main" xmlns:w14="http://schemas.microsoft.com/office/word/2010/wordml" xmlns:w15="http://schemas.microsoft.com/office/word/2012/wordml" xmlns:w16cex="http://schemas.microsoft.com/office/word/2018/wordml/cex" xmlns:w16cid="http://schemas.microsoft.com/office/word/2016/wordml/cid" xmlns:w16="http://schemas.microsoft.com/office/word/2018/wordml" xmlns:w16sdtdh="http://schemas.microsoft.com/office/word/2020/wordml/sdtdatahash" xmlns:w16se="http://schemas.microsoft.com/office/word/2015/wordml/symex" xmlns:wpg="http://schemas.microsoft.com/office/word/2010/wordprocessingGroup" xmlns:wpi="http://schemas.microsoft.com/office/word/2010/wordprocessingInk" xmlns:wne="http://schemas.microsoft.com/office/word/2006/wordml" xmlns:wps="http://schemas.microsoft.com/office/word/2010/wordprocessingShape" mc:Ignorable="w14 w15 w16se w16cid w16 w16cex w16sdtdh wp14">
   <w:body>
     <w:p>
       <w:pPr>
@@ -581,7 +581,23 @@
           <w:sz w:val="21"/>
           <w:szCs w:val="21"/>
         </w:rPr>
-        <w:t>This Preliminary Assessment Report provides a high-level overview of your facility's current readiness position concerning the upcoming requirements of the Energy Efficiency and Conservation Act (EECA). The analysis is derived from the self-reported parameters provided during the EECA Compliance &amp; Readiness Checklist assessment.</w:t>
+        <w:t xml:space="preserve">This Preliminary Assessment Report provides a </w:t>
+      </w:r>
+      <w:r>
+        <w:rPr>
+          <w:rFonts w:asciiTheme="majorHAnsi" w:hAnsiTheme="majorHAnsi" w:cstheme="majorHAnsi"/>
+          <w:sz w:val="21"/>
+          <w:szCs w:val="21"/>
+        </w:rPr>
+        <w:t>high-level overview of your facility's current readiness position concerning the upcoming requirements of the Energy Efficiency and Conservation Act (EECA). The analysis is derived from the self-reported parameters provided during the EECA Compliance &amp; Rea</w:t>
+      </w:r>
+      <w:r>
+        <w:rPr>
+          <w:rFonts w:asciiTheme="majorHAnsi" w:hAnsiTheme="majorHAnsi" w:cstheme="majorHAnsi"/>
+          <w:sz w:val="21"/>
+          <w:szCs w:val="21"/>
+        </w:rPr>
+        <w:t>diness Checklist assessment.</w:t>
       </w:r>
     </w:p>
     <w:tbl>
@@ -611,6 +627,7 @@
             <w:pPr>
               <w:pStyle w:val="Heading3"/>
               <w:ind w:left="180"/>
+              <w:outlineLvl w:val="2"/>
               <w:rPr>
                 <w:rFonts w:cstheme="majorHAnsi"/>
               </w:rPr>
@@ -819,7 +836,16 @@
           <w:sz w:val="21"/>
           <w:szCs w:val="21"/>
         </w:rPr>
-        <w:t xml:space="preserve">Your facility demonstrates a baseline understanding of the EECA requirements with certain elements already initiated. However, critical structural gaps remain in formal data readiness, systemic Energy Management System (EnMS) deployment, and definitive audit </w:t>
+        <w:t>Your facility demonstrates a baseline understanding of the EECA requirements with certain elements already initiated. However, critical structural gaps remain in formal data readiness, systemic Energy Management System (EnMS) deployment, and definitive aud</w:t>
+      </w:r>
+      <w:r>
+        <w:rPr>
+          <w:rFonts w:asciiTheme="majorHAnsi" w:hAnsiTheme="majorHAnsi" w:cstheme="majorHAnsi"/>
+          <w:color w:val="4F81BD" w:themeColor="accent1"/>
+          <w:sz w:val="21"/>
+          <w:szCs w:val="21"/>
+        </w:rPr>
+        <w:t xml:space="preserve">it </w:t>
       </w:r>
       <w:r>
         <w:rPr>
@@ -1254,7 +1280,7 @@
                 <w:rFonts w:asciiTheme="majorHAnsi" w:hAnsiTheme="majorHAnsi" w:cstheme="majorHAnsi"/>
                 <w:color w:val="000000" w:themeColor="text1"/>
               </w:rPr>
-              <w:t>List of Selected Elements</w:t>
+              <w:t>[Q6 Elements]</w:t>
             </w:r>
           </w:p>
         </w:tc>
@@ -1306,7 +1332,7 @@
                 <w:rFonts w:asciiTheme="majorHAnsi" w:hAnsiTheme="majorHAnsi" w:cstheme="majorHAnsi"/>
                 <w:color w:val="000000" w:themeColor="text1"/>
               </w:rPr>
-              <w:t>List of Selected Elements</w:t>
+              <w:t>[Q7 Elements]</w:t>
             </w:r>
           </w:p>
         </w:tc>
@@ -1515,7 +1541,15 @@
           <w:sz w:val="21"/>
           <w:szCs w:val="21"/>
         </w:rPr>
-        <w:t>A Registered Energy Manager (REM) has not yet been formally appointed.</w:t>
+        <w:t xml:space="preserve">A Registered Energy Manager (REM) has not yet been formally </w:t>
+      </w:r>
+      <w:r>
+        <w:rPr>
+          <w:rFonts w:asciiTheme="majorHAnsi" w:hAnsiTheme="majorHAnsi" w:cstheme="majorHAnsi"/>
+          <w:sz w:val="21"/>
+          <w:szCs w:val="21"/>
+        </w:rPr>
+        <w:t>appointed.</w:t>
       </w:r>
     </w:p>
     <w:p>
@@ -1615,7 +1649,14 @@
           <w:color w:val="548DD4" w:themeColor="text2" w:themeTint="99"/>
         </w:rPr>
         <w:lastRenderedPageBreak/>
-        <w:t>3. Indicative EECA Compliance Timeline</w:t>
+        <w:t xml:space="preserve">3. </w:t>
+      </w:r>
+      <w:r>
+        <w:rPr>
+          <w:rFonts w:cstheme="majorHAnsi"/>
+          <w:color w:val="548DD4" w:themeColor="text2" w:themeTint="99"/>
+        </w:rPr>
+        <w:t>Indicative EECA Compliance Timeline</w:t>
       </w:r>
     </w:p>
     <w:p>
@@ -1737,7 +1778,14 @@
           <w:color w:val="4F81BD" w:themeColor="accent1"/>
         </w:rPr>
         <w:lastRenderedPageBreak/>
-        <w:t>4. Recommendation of Implementation Actions</w:t>
+        <w:t>4. Recommendation of</w:t>
+      </w:r>
+      <w:r>
+        <w:rPr>
+          <w:rFonts w:cstheme="majorHAnsi"/>
+          <w:color w:val="4F81BD" w:themeColor="accent1"/>
+        </w:rPr>
+        <w:t xml:space="preserve"> Implementation Actions</w:t>
       </w:r>
     </w:p>
     <w:p>
@@ -1755,7 +1803,15 @@
           <w:sz w:val="21"/>
           <w:szCs w:val="21"/>
         </w:rPr>
-        <w:t>To bridge the compliance gaps identified in your self-assessment, the following framework categorizes the mandatory EECA requirements. Your facility's engineering and management teams may utilize this structured workspace to outline specific, assignable action plans.</w:t>
+        <w:t>To bridge the compliance gaps identified in your self-assessment, the following framework categorizes the mandatory EECA requirements. Your facility's engineering and management teams may utilize this structured workspace to outline</w:t>
+      </w:r>
+      <w:r>
+        <w:rPr>
+          <w:rFonts w:asciiTheme="majorHAnsi" w:hAnsiTheme="majorHAnsi" w:cstheme="majorHAnsi"/>
+          <w:sz w:val="21"/>
+          <w:szCs w:val="21"/>
+        </w:rPr>
+        <w:t xml:space="preserve"> specific, assignable action plans.</w:t>
       </w:r>
       <w:r>
         <w:rPr>
@@ -2002,7 +2058,13 @@
               <w:rPr>
                 <w:rFonts w:asciiTheme="majorHAnsi" w:hAnsiTheme="majorHAnsi" w:cstheme="majorHAnsi"/>
               </w:rPr>
-              <w:t>[Auto-filled] e.g., Partial policies.</w:t>
+              <w:t xml:space="preserve">[Auto-filled] e.g., Partial </w:t>
+            </w:r>
+            <w:r>
+              <w:rPr>
+                <w:rFonts w:asciiTheme="majorHAnsi" w:hAnsiTheme="majorHAnsi" w:cstheme="majorHAnsi"/>
+              </w:rPr>
+              <w:t>policies.</w:t>
             </w:r>
           </w:p>
         </w:tc>
@@ -2272,6 +2334,7 @@
             <w:pPr>
               <w:pStyle w:val="Heading2"/>
               <w:ind w:left="-23"/>
+              <w:outlineLvl w:val="1"/>
               <w:rPr>
                 <w:rFonts w:cstheme="majorHAnsi"/>
                 <w:b/>
@@ -2293,6 +2356,7 @@
           <w:p>
             <w:pPr>
               <w:pStyle w:val="Heading3"/>
+              <w:outlineLvl w:val="2"/>
               <w:rPr>
                 <w:rFonts w:cstheme="majorHAnsi"/>
                 <w:color w:val="548DD4" w:themeColor="text2" w:themeTint="99"/>
@@ -2342,6 +2406,7 @@
           <w:p>
             <w:pPr>
               <w:pStyle w:val="Heading3"/>
+              <w:outlineLvl w:val="2"/>
               <w:rPr>
                 <w:rFonts w:cstheme="majorHAnsi"/>
                 <w:b/>
@@ -2387,6 +2452,7 @@
                 <w:numId w:val="10"/>
               </w:numPr>
               <w:ind w:left="810"/>
+              <w:outlineLvl w:val="2"/>
               <w:rPr>
                 <w:rFonts w:cstheme="majorHAnsi"/>
                 <w:color w:val="000000" w:themeColor="text1"/>
@@ -2408,6 +2474,7 @@
                 <w:numId w:val="10"/>
               </w:numPr>
               <w:ind w:left="810"/>
+              <w:outlineLvl w:val="2"/>
               <w:rPr>
                 <w:rFonts w:cstheme="majorHAnsi"/>
                 <w:color w:val="000000" w:themeColor="text1"/>
@@ -2429,6 +2496,7 @@
                 <w:numId w:val="10"/>
               </w:numPr>
               <w:ind w:left="810"/>
+              <w:outlineLvl w:val="2"/>
               <w:rPr>
                 <w:rFonts w:cstheme="majorHAnsi"/>
                 <w:color w:val="000000" w:themeColor="text1"/>
@@ -2450,6 +2518,7 @@
                 <w:numId w:val="10"/>
               </w:numPr>
               <w:ind w:left="810"/>
+              <w:outlineLvl w:val="2"/>
               <w:rPr>
                 <w:rFonts w:cstheme="majorHAnsi"/>
                 <w:color w:val="000000" w:themeColor="text1"/>
@@ -2471,6 +2540,7 @@
                 <w:numId w:val="10"/>
               </w:numPr>
               <w:ind w:left="810"/>
+              <w:outlineLvl w:val="2"/>
               <w:rPr>
                 <w:rFonts w:cstheme="majorHAnsi"/>
                 <w:color w:val="000000" w:themeColor="text1"/>
@@ -2492,6 +2562,7 @@
                 <w:numId w:val="10"/>
               </w:numPr>
               <w:ind w:left="810"/>
+              <w:outlineLvl w:val="2"/>
               <w:rPr>
                 <w:rFonts w:cstheme="majorHAnsi"/>
                 <w:color w:val="000000" w:themeColor="text1"/>
@@ -2509,6 +2580,7 @@
             <w:pPr>
               <w:pStyle w:val="Heading3"/>
               <w:ind w:left="180"/>
+              <w:outlineLvl w:val="2"/>
               <w:rPr>
                 <w:rFonts w:cstheme="majorHAnsi"/>
               </w:rPr>
@@ -2526,6 +2598,7 @@
             <w:pPr>
               <w:pStyle w:val="Heading3"/>
               <w:ind w:left="180"/>
+              <w:outlineLvl w:val="2"/>
               <w:rPr>
                 <w:rFonts w:cstheme="majorHAnsi"/>
                 <w:b/>
@@ -2537,6 +2610,7 @@
             <w:pPr>
               <w:pStyle w:val="Heading3"/>
               <w:ind w:left="180"/>
+              <w:outlineLvl w:val="2"/>
               <w:rPr>
                 <w:rFonts w:cstheme="majorHAnsi"/>
                 <w:b/>
@@ -2570,6 +2644,7 @@
                 <w:numId w:val="10"/>
               </w:numPr>
               <w:ind w:left="810"/>
+              <w:outlineLvl w:val="2"/>
               <w:rPr>
                 <w:rFonts w:cstheme="majorHAnsi"/>
                 <w:color w:val="000000" w:themeColor="text1"/>
@@ -2591,6 +2666,7 @@
                 <w:numId w:val="10"/>
               </w:numPr>
               <w:ind w:left="810"/>
+              <w:outlineLvl w:val="2"/>
               <w:rPr>
                 <w:rFonts w:cstheme="majorHAnsi"/>
                 <w:color w:val="000000" w:themeColor="text1"/>
@@ -2612,6 +2688,7 @@
                 <w:numId w:val="10"/>
               </w:numPr>
               <w:ind w:left="810"/>
+              <w:outlineLvl w:val="2"/>
               <w:rPr>
                 <w:rFonts w:cstheme="majorHAnsi"/>
                 <w:color w:val="000000" w:themeColor="text1"/>
@@ -2633,6 +2710,7 @@
                 <w:numId w:val="10"/>
               </w:numPr>
               <w:ind w:left="810"/>
+              <w:outlineLvl w:val="2"/>
               <w:rPr>
                 <w:rFonts w:cstheme="majorHAnsi"/>
                 <w:color w:val="000000" w:themeColor="text1"/>
@@ -2650,6 +2728,7 @@
             <w:pPr>
               <w:pStyle w:val="Heading3"/>
               <w:ind w:left="810"/>
+              <w:outlineLvl w:val="2"/>
               <w:rPr>
                 <w:rFonts w:cstheme="majorHAnsi"/>
                 <w:color w:val="000000" w:themeColor="text1"/>
@@ -2668,6 +2747,7 @@
             <w:pPr>
               <w:pStyle w:val="Heading3"/>
               <w:ind w:left="180"/>
+              <w:outlineLvl w:val="2"/>
               <w:rPr>
                 <w:rFonts w:cstheme="majorHAnsi"/>
               </w:rPr>
@@ -2694,6 +2774,7 @@
             <w:pPr>
               <w:pStyle w:val="Heading3"/>
               <w:ind w:left="180"/>
+              <w:outlineLvl w:val="2"/>
               <w:rPr>
                 <w:rFonts w:cstheme="majorHAnsi"/>
                 <w:color w:val="000000" w:themeColor="text1"/>
@@ -2716,6 +2797,7 @@
                 <w:numId w:val="10"/>
               </w:numPr>
               <w:ind w:left="810"/>
+              <w:outlineLvl w:val="2"/>
               <w:rPr>
                 <w:rFonts w:cstheme="majorHAnsi"/>
                 <w:color w:val="000000" w:themeColor="text1"/>
@@ -2737,6 +2819,7 @@
                 <w:numId w:val="10"/>
               </w:numPr>
               <w:ind w:left="810"/>
+              <w:outlineLvl w:val="2"/>
               <w:rPr>
                 <w:rFonts w:cstheme="majorHAnsi"/>
                 <w:color w:val="000000" w:themeColor="text1"/>
@@ -2747,23 +2830,7 @@
                 <w:rFonts w:cstheme="majorHAnsi"/>
                 <w:color w:val="000000" w:themeColor="text1"/>
               </w:rPr>
-              <w:t>Energy Planning &amp; Baselines: Identifying Significant Energy Uses (SEUs), establishing a valid 12-month energy consumption baseline, and setting quantifiable Energy Performance Indicators (</w:t>
-            </w:r>
-            <w:proofErr w:type="spellStart"/>
-            <w:r>
-              <w:rPr>
-                <w:rFonts w:cstheme="majorHAnsi"/>
-                <w:color w:val="000000" w:themeColor="text1"/>
-              </w:rPr>
-              <w:t>EnPIs</w:t>
-            </w:r>
-            <w:proofErr w:type="spellEnd"/>
-            <w:r>
-              <w:rPr>
-                <w:rFonts w:cstheme="majorHAnsi"/>
-                <w:color w:val="000000" w:themeColor="text1"/>
-              </w:rPr>
-              <w:t>) and reduction targets.</w:t>
+              <w:t>Energy Planning &amp; Baselines: Identifying Significant Energy Uses (SEUs), establishing a valid 12-month energy consumption baseline, and setting quantifiable Energy Performance Indicators (EnPIs) and reduction targets.</w:t>
             </w:r>
           </w:p>
           <w:p>
@@ -2774,6 +2841,7 @@
                 <w:numId w:val="10"/>
               </w:numPr>
               <w:ind w:left="810"/>
+              <w:outlineLvl w:val="2"/>
               <w:rPr>
                 <w:rFonts w:cstheme="majorHAnsi"/>
                 <w:color w:val="000000" w:themeColor="text1"/>
@@ -2795,6 +2863,7 @@
                 <w:numId w:val="10"/>
               </w:numPr>
               <w:ind w:left="810"/>
+              <w:outlineLvl w:val="2"/>
               <w:rPr>
                 <w:rFonts w:cstheme="majorHAnsi"/>
                 <w:color w:val="000000" w:themeColor="text1"/>
@@ -2805,23 +2874,7 @@
                 <w:rFonts w:cstheme="majorHAnsi"/>
                 <w:color w:val="000000" w:themeColor="text1"/>
               </w:rPr>
-              <w:t xml:space="preserve">Measurement &amp; Verification (M&amp;V): Deployment of continuous, real-time, or </w:t>
-            </w:r>
-            <w:proofErr w:type="spellStart"/>
-            <w:r>
-              <w:rPr>
-                <w:rFonts w:cstheme="majorHAnsi"/>
-                <w:color w:val="000000" w:themeColor="text1"/>
-              </w:rPr>
-              <w:t>highl</w:t>
-            </w:r>
-            <w:proofErr w:type="spellEnd"/>
-            <w:r>
-              <w:rPr>
-                <w:rFonts w:cstheme="majorHAnsi"/>
-                <w:color w:val="000000" w:themeColor="text1"/>
-              </w:rPr>
-              <w:t xml:space="preserve"> structured periodic monitoring of energy consumption to track progress against set targets.</w:t>
+              <w:t>Measurement &amp; Verification (M&amp;V): Deployment of continuous, real-time, or highl structured periodic monitoring of energy consumption to track progress against set targets.</w:t>
             </w:r>
           </w:p>
           <w:p>
@@ -2832,6 +2885,7 @@
                 <w:numId w:val="10"/>
               </w:numPr>
               <w:ind w:left="810"/>
+              <w:outlineLvl w:val="2"/>
               <w:rPr>
                 <w:rFonts w:cstheme="majorHAnsi"/>
                 <w:color w:val="000000" w:themeColor="text1"/>
@@ -2879,6 +2933,7 @@
             <w:pPr>
               <w:pStyle w:val="Heading3"/>
               <w:ind w:left="180"/>
+              <w:outlineLvl w:val="2"/>
               <w:rPr>
                 <w:rFonts w:cstheme="majorHAnsi"/>
               </w:rPr>
@@ -2905,6 +2960,7 @@
             <w:pPr>
               <w:pStyle w:val="Heading3"/>
               <w:ind w:left="180"/>
+              <w:outlineLvl w:val="2"/>
               <w:rPr>
                 <w:rFonts w:cstheme="majorHAnsi"/>
                 <w:color w:val="000000" w:themeColor="text1"/>
@@ -2940,6 +2996,7 @@
                 <w:numId w:val="10"/>
               </w:numPr>
               <w:ind w:left="810"/>
+              <w:outlineLvl w:val="2"/>
               <w:rPr>
                 <w:rFonts w:cstheme="majorHAnsi"/>
                 <w:color w:val="000000" w:themeColor="text1"/>
@@ -2998,6 +3055,7 @@
                 <w:numId w:val="10"/>
               </w:numPr>
               <w:ind w:left="810"/>
+              <w:outlineLvl w:val="2"/>
               <w:rPr>
                 <w:rFonts w:cstheme="majorHAnsi"/>
                 <w:b/>
@@ -3022,6 +3080,7 @@
                 <w:ilvl w:val="1"/>
                 <w:numId w:val="10"/>
               </w:numPr>
+              <w:outlineLvl w:val="2"/>
               <w:rPr>
                 <w:rFonts w:cstheme="majorHAnsi"/>
                 <w:color w:val="000000" w:themeColor="text1"/>
@@ -3042,6 +3101,7 @@
                 <w:ilvl w:val="1"/>
                 <w:numId w:val="10"/>
               </w:numPr>
+              <w:outlineLvl w:val="2"/>
               <w:rPr>
                 <w:rFonts w:cstheme="majorHAnsi"/>
                 <w:color w:val="000000" w:themeColor="text1"/>
@@ -3076,6 +3136,7 @@
                 <w:ilvl w:val="1"/>
                 <w:numId w:val="10"/>
               </w:numPr>
+              <w:outlineLvl w:val="2"/>
               <w:rPr>
                 <w:rFonts w:cstheme="majorHAnsi"/>
                 <w:color w:val="000000" w:themeColor="text1"/>
@@ -3110,6 +3171,7 @@
                 <w:ilvl w:val="1"/>
                 <w:numId w:val="10"/>
               </w:numPr>
+              <w:outlineLvl w:val="2"/>
               <w:rPr>
                 <w:rFonts w:cstheme="majorHAnsi"/>
                 <w:color w:val="000000" w:themeColor="text1"/>
@@ -3170,6 +3232,7 @@
             <w:pPr>
               <w:pStyle w:val="Heading3"/>
               <w:ind w:left="180"/>
+              <w:outlineLvl w:val="2"/>
               <w:rPr>
                 <w:rFonts w:cstheme="majorHAnsi"/>
               </w:rPr>
@@ -3197,6 +3260,7 @@
             <w:pPr>
               <w:pStyle w:val="Heading3"/>
               <w:ind w:left="180"/>
+              <w:outlineLvl w:val="2"/>
               <w:rPr>
                 <w:rFonts w:cstheme="majorHAnsi"/>
                 <w:color w:val="000000" w:themeColor="text1"/>
@@ -3218,6 +3282,7 @@
                 <w:numId w:val="12"/>
               </w:numPr>
               <w:ind w:left="810"/>
+              <w:outlineLvl w:val="2"/>
               <w:rPr>
                 <w:rFonts w:cstheme="majorHAnsi"/>
                 <w:color w:val="000000" w:themeColor="text1"/>
@@ -3248,6 +3313,7 @@
                 <w:numId w:val="12"/>
               </w:numPr>
               <w:ind w:left="810"/>
+              <w:outlineLvl w:val="2"/>
               <w:rPr>
                 <w:rFonts w:cstheme="majorHAnsi"/>
                 <w:color w:val="000000" w:themeColor="text1"/>
@@ -3278,6 +3344,7 @@
                 <w:numId w:val="12"/>
               </w:numPr>
               <w:ind w:left="810"/>
+              <w:outlineLvl w:val="2"/>
               <w:rPr>
                 <w:rFonts w:cstheme="majorHAnsi"/>
                 <w:color w:val="000000" w:themeColor="text1"/>
@@ -3333,6 +3400,7 @@
             <w:pPr>
               <w:pStyle w:val="Heading3"/>
               <w:ind w:left="180"/>
+              <w:outlineLvl w:val="2"/>
               <w:rPr>
                 <w:rFonts w:cstheme="majorHAnsi"/>
               </w:rPr>
@@ -3359,6 +3427,7 @@
             <w:pPr>
               <w:pStyle w:val="Heading3"/>
               <w:ind w:left="180"/>
+              <w:outlineLvl w:val="2"/>
               <w:rPr>
                 <w:rFonts w:cstheme="majorHAnsi"/>
                 <w:color w:val="000000" w:themeColor="text1"/>
@@ -3380,6 +3449,7 @@
                 <w:numId w:val="13"/>
               </w:numPr>
               <w:ind w:left="810"/>
+              <w:outlineLvl w:val="2"/>
               <w:rPr>
                 <w:rFonts w:cstheme="majorHAnsi"/>
                 <w:color w:val="000000" w:themeColor="text1"/>
@@ -3399,23 +3469,7 @@
                 <w:rFonts w:cstheme="majorHAnsi"/>
                 <w:color w:val="000000" w:themeColor="text1"/>
               </w:rPr>
-              <w:t xml:space="preserve">: The Energy Intensity Performance (EIP) of the building is calculated as the Building Energy Intensity (BEI) in kWh/m2/year, </w:t>
-            </w:r>
-            <w:proofErr w:type="gramStart"/>
-            <w:r>
-              <w:rPr>
-                <w:rFonts w:cstheme="majorHAnsi"/>
-                <w:color w:val="000000" w:themeColor="text1"/>
-              </w:rPr>
-              <w:t>taking into account</w:t>
-            </w:r>
-            <w:proofErr w:type="gramEnd"/>
-            <w:r>
-              <w:rPr>
-                <w:rFonts w:cstheme="majorHAnsi"/>
-                <w:color w:val="000000" w:themeColor="text1"/>
-              </w:rPr>
-              <w:t>:</w:t>
+              <w:t>: The Energy Intensity Performance (EIP) of the building is calculated as the Building Energy Intensity (BEI) in kWh/m2/year, taking into account:</w:t>
             </w:r>
           </w:p>
           <w:p>
@@ -3426,6 +3480,7 @@
                 <w:numId w:val="13"/>
               </w:numPr>
               <w:ind w:left="1440"/>
+              <w:outlineLvl w:val="2"/>
               <w:rPr>
                 <w:rFonts w:cstheme="majorHAnsi"/>
                 <w:color w:val="000000" w:themeColor="text1"/>
@@ -3447,6 +3502,7 @@
                 <w:numId w:val="13"/>
               </w:numPr>
               <w:ind w:left="1440"/>
+              <w:outlineLvl w:val="2"/>
               <w:rPr>
                 <w:rFonts w:cstheme="majorHAnsi"/>
                 <w:color w:val="000000" w:themeColor="text1"/>
@@ -3468,6 +3524,7 @@
                 <w:numId w:val="13"/>
               </w:numPr>
               <w:ind w:left="1440"/>
+              <w:outlineLvl w:val="2"/>
               <w:rPr>
                 <w:rFonts w:cstheme="majorHAnsi"/>
                 <w:color w:val="000000" w:themeColor="text1"/>
@@ -3489,6 +3546,7 @@
                 <w:numId w:val="13"/>
               </w:numPr>
               <w:ind w:left="810"/>
+              <w:outlineLvl w:val="2"/>
               <w:rPr>
                 <w:rFonts w:cstheme="majorHAnsi"/>
                 <w:color w:val="000000" w:themeColor="text1"/>
@@ -3575,7 +3633,15 @@
           <w:sz w:val="21"/>
           <w:szCs w:val="21"/>
         </w:rPr>
-        <w:t>Achieving compliance under the Energy Efficiency and Conservation Act (EECA) can be complex, but you do not have to navigate it alone. Sandhurst Advisory is ready to support your organization through every step of your EECA compliance journey.</w:t>
+        <w:t>Achieving compliance under the Energy Efficienc</w:t>
+      </w:r>
+      <w:r>
+        <w:rPr>
+          <w:rFonts w:asciiTheme="majorHAnsi" w:hAnsiTheme="majorHAnsi" w:cstheme="majorHAnsi"/>
+          <w:sz w:val="21"/>
+          <w:szCs w:val="21"/>
+        </w:rPr>
+        <w:t>y and Conservation Act (EECA) can be complex, but you do not have to navigate it alone. Sandhurst Advisory is ready to support your organization through every step of your EECA compliance journey.</w:t>
       </w:r>
     </w:p>
     <w:p>
@@ -3593,7 +3659,15 @@
           <w:sz w:val="21"/>
           <w:szCs w:val="21"/>
         </w:rPr>
-        <w:t>We offer a comprehensive suite of professional energy management services tailored to your operational scale, including:</w:t>
+        <w:t>We offer a comprehensive suite of professional energy manag</w:t>
+      </w:r>
+      <w:r>
+        <w:rPr>
+          <w:rFonts w:asciiTheme="majorHAnsi" w:hAnsiTheme="majorHAnsi" w:cstheme="majorHAnsi"/>
+          <w:sz w:val="21"/>
+          <w:szCs w:val="21"/>
+        </w:rPr>
+        <w:t>ement services tailored to your operational scale, including:</w:t>
       </w:r>
     </w:p>
     <w:p>
@@ -3674,7 +3748,15 @@
           <w:sz w:val="21"/>
           <w:szCs w:val="21"/>
         </w:rPr>
-        <w:t>: Full-scope assessments conducted by Registered Energy Auditors (REAs).</w:t>
+        <w:t xml:space="preserve">: Full-scope assessments conducted by Registered Energy Auditors </w:t>
+      </w:r>
+      <w:r>
+        <w:rPr>
+          <w:rFonts w:asciiTheme="majorHAnsi" w:hAnsiTheme="majorHAnsi" w:cstheme="majorHAnsi"/>
+          <w:sz w:val="21"/>
+          <w:szCs w:val="21"/>
+        </w:rPr>
+        <w:t>(REAs).</w:t>
       </w:r>
     </w:p>
     <w:p>
@@ -3768,7 +3850,15 @@
           <w:sz w:val="21"/>
           <w:szCs w:val="21"/>
         </w:rPr>
-        <w:t>: Advanced data aggregation and IoT telemetry to effortlessly capture your 12-month energy baselines and continuous performance.</w:t>
+        <w:t>: Advanced data aggregation and IoT telemetry to effortlessly ca</w:t>
+      </w:r>
+      <w:r>
+        <w:rPr>
+          <w:rFonts w:asciiTheme="majorHAnsi" w:hAnsiTheme="majorHAnsi" w:cstheme="majorHAnsi"/>
+          <w:sz w:val="21"/>
+          <w:szCs w:val="21"/>
+        </w:rPr>
+        <w:t>pture your 12-month energy baselines and continuous performance.</w:t>
       </w:r>
     </w:p>
     <w:p>
@@ -3843,7 +3933,34 @@
                 <w:color w:val="64748B"/>
                 <w:sz w:val="18"/>
               </w:rPr>
-              <w:t>Disclaimer: This report is based solely on the information provided through the EECA Compliance &amp; Readiness Self-Check tool. It is intended as a preliminary advisory document only and does not constitute legal confirmation of compliance status, formal regulatory determination, or professional certification under the Energy Efficiency and Conservation Act 2024. Sandhurst Advisory takes no liability for this report as it is an auto-generated self-assessment. User discretion is strictly required, and formal consultation is recommended for definitive compliance mapping.</w:t>
+              <w:t xml:space="preserve">Disclaimer: This report is based </w:t>
+            </w:r>
+            <w:r>
+              <w:rPr>
+                <w:rFonts w:asciiTheme="majorHAnsi" w:hAnsiTheme="majorHAnsi" w:cstheme="majorHAnsi"/>
+                <w:i/>
+                <w:color w:val="64748B"/>
+                <w:sz w:val="18"/>
+              </w:rPr>
+              <w:t>solely on the information provided through the EECA Compliance &amp; Readiness Self-Check tool. It is intended as a preliminary advisory document only and does not constitute legal confirmation of compliance status, formal regulatory determination, or professi</w:t>
+            </w:r>
+            <w:r>
+              <w:rPr>
+                <w:rFonts w:asciiTheme="majorHAnsi" w:hAnsiTheme="majorHAnsi" w:cstheme="majorHAnsi"/>
+                <w:i/>
+                <w:color w:val="64748B"/>
+                <w:sz w:val="18"/>
+              </w:rPr>
+              <w:t>onal certification under the Energy Efficiency and Conservation Act 2024. Sandhurst Advisory takes no liability for this report as it is an auto-generated self-assessment. User discretion is strictly required, and formal consultation is recommended for def</w:t>
+            </w:r>
+            <w:r>
+              <w:rPr>
+                <w:rFonts w:asciiTheme="majorHAnsi" w:hAnsiTheme="majorHAnsi" w:cstheme="majorHAnsi"/>
+                <w:i/>
+                <w:color w:val="64748B"/>
+                <w:sz w:val="18"/>
+              </w:rPr>
+              <w:t>initive compliance mapping.</w:t>
             </w:r>
           </w:p>
         </w:tc>
@@ -3868,7 +3985,7 @@
 </file>
 
 <file path=word/endnotes.xml><?xml version="1.0" encoding="utf-8"?>
-<w:endnotes xmlns:wpc="http://schemas.microsoft.com/office/word/2010/wordprocessingCanvas" xmlns:cx="http://schemas.microsoft.com/office/drawing/2014/chartex" xmlns:cx1="http://schemas.microsoft.com/office/drawing/2015/9/8/chartex" xmlns:cx2="http://schemas.microsoft.com/office/drawing/2015/10/21/chartex" xmlns:cx3="http://schemas.microsoft.com/office/drawing/2016/5/9/chartex" xmlns:cx4="http://schemas.microsoft.com/office/drawing/2016/5/10/chartex" xmlns:cx5="http://schemas.microsoft.com/office/drawing/2016/5/11/chartex" xmlns:cx6="http://schemas.microsoft.com/office/drawing/2016/5/12/chartex" xmlns:cx7="http://schemas.microsoft.com/office/drawing/2016/5/13/chartex" xmlns:cx8="http://schemas.microsoft.com/office/drawing/2016/5/14/chartex" xmlns:mc="http://schemas.openxmlformats.org/markup-compatibility/2006" xmlns:aink="http://schemas.microsoft.com/office/drawing/2016/ink" xmlns:am3d="http://schemas.microsoft.com/office/drawing/2017/model3d" xmlns:o="urn:schemas-microsoft-com:office:office" xmlns:oel="http://schemas.microsoft.com/office/2019/extlst" xmlns:r="http://schemas.openxmlformats.org/officeDocument/2006/relationships" xmlns:m="http://schemas.openxmlformats.org/officeDocument/2006/math" xmlns:v="urn:schemas-microsoft-com:vml" xmlns:wp14="http://schemas.microsoft.com/office/word/2010/wordprocessingDrawing" xmlns:wp="http://schemas.openxmlformats.org/drawingml/2006/wordprocessingDrawing" xmlns:w10="urn:schemas-microsoft-com:office:word" xmlns:w="http://schemas.openxmlformats.org/wordprocessingml/2006/main" xmlns:w14="http://schemas.microsoft.com/office/word/2010/wordml" xmlns:w15="http://schemas.microsoft.com/office/word/2012/wordml" xmlns:w16cex="http://schemas.microsoft.com/office/word/2018/wordml/cex" xmlns:w16cid="http://schemas.microsoft.com/office/word/2016/wordml/cid" xmlns:w16="http://schemas.microsoft.com/office/word/2018/wordml" xmlns:w16du="http://schemas.microsoft.com/office/word/2023/wordml/word16du" xmlns:w16sdtdh="http://schemas.microsoft.com/office/word/2020/wordml/sdtdatahash" xmlns:w16sdtfl="http://schemas.microsoft.com/office/word/2024/wordml/sdtformatlock" xmlns:w16se="http://schemas.microsoft.com/office/word/2015/wordml/symex" xmlns:wpg="http://schemas.microsoft.com/office/word/2010/wordprocessingGroup" xmlns:wpi="http://schemas.microsoft.com/office/word/2010/wordprocessingInk" xmlns:wne="http://schemas.microsoft.com/office/word/2006/wordml" xmlns:wps="http://schemas.microsoft.com/office/word/2010/wordprocessingShape" mc:Ignorable="w14 w15 w16se w16cid w16 w16cex w16sdtdh w16sdtfl w16du wp14">
+<w:endnotes xmlns:wpc="http://schemas.microsoft.com/office/word/2010/wordprocessingCanvas" xmlns:cx="http://schemas.microsoft.com/office/drawing/2014/chartex" xmlns:cx1="http://schemas.microsoft.com/office/drawing/2015/9/8/chartex" xmlns:cx2="http://schemas.microsoft.com/office/drawing/2015/10/21/chartex" xmlns:cx3="http://schemas.microsoft.com/office/drawing/2016/5/9/chartex" xmlns:cx4="http://schemas.microsoft.com/office/drawing/2016/5/10/chartex" xmlns:cx5="http://schemas.microsoft.com/office/drawing/2016/5/11/chartex" xmlns:cx6="http://schemas.microsoft.com/office/drawing/2016/5/12/chartex" xmlns:cx7="http://schemas.microsoft.com/office/drawing/2016/5/13/chartex" xmlns:cx8="http://schemas.microsoft.com/office/drawing/2016/5/14/chartex" xmlns:mc="http://schemas.openxmlformats.org/markup-compatibility/2006" xmlns:aink="http://schemas.microsoft.com/office/drawing/2016/ink" xmlns:am3d="http://schemas.microsoft.com/office/drawing/2017/model3d" xmlns:o="urn:schemas-microsoft-com:office:office" xmlns:r="http://schemas.openxmlformats.org/officeDocument/2006/relationships" xmlns:m="http://schemas.openxmlformats.org/officeDocument/2006/math" xmlns:v="urn:schemas-microsoft-com:vml" xmlns:wp14="http://schemas.microsoft.com/office/word/2010/wordprocessingDrawing" xmlns:wp="http://schemas.openxmlformats.org/drawingml/2006/wordprocessingDrawing" xmlns:w10="urn:schemas-microsoft-com:office:word" xmlns:w="http://schemas.openxmlformats.org/wordprocessingml/2006/main" xmlns:w14="http://schemas.microsoft.com/office/word/2010/wordml" xmlns:w15="http://schemas.microsoft.com/office/word/2012/wordml" xmlns:w16cex="http://schemas.microsoft.com/office/word/2018/wordml/cex" xmlns:w16cid="http://schemas.microsoft.com/office/word/2016/wordml/cid" xmlns:w16="http://schemas.microsoft.com/office/word/2018/wordml" xmlns:w16sdtdh="http://schemas.microsoft.com/office/word/2020/wordml/sdtdatahash" xmlns:w16se="http://schemas.microsoft.com/office/word/2015/wordml/symex" xmlns:wpg="http://schemas.microsoft.com/office/word/2010/wordprocessingGroup" xmlns:wpi="http://schemas.microsoft.com/office/word/2010/wordprocessingInk" xmlns:wne="http://schemas.microsoft.com/office/word/2006/wordml" xmlns:wps="http://schemas.microsoft.com/office/word/2010/wordprocessingShape" mc:Ignorable="w14 w15 w16se w16cid w16 w16cex w16sdtdh wp14">
   <w:endnote w:type="separator" w:id="-1">
     <w:p>
       <w:pPr>
@@ -3893,7 +4010,7 @@
 </file>
 
 <file path=word/footnotes.xml><?xml version="1.0" encoding="utf-8"?>
-<w:footnotes xmlns:wpc="http://schemas.microsoft.com/office/word/2010/wordprocessingCanvas" xmlns:cx="http://schemas.microsoft.com/office/drawing/2014/chartex" xmlns:cx1="http://schemas.microsoft.com/office/drawing/2015/9/8/chartex" xmlns:cx2="http://schemas.microsoft.com/office/drawing/2015/10/21/chartex" xmlns:cx3="http://schemas.microsoft.com/office/drawing/2016/5/9/chartex" xmlns:cx4="http://schemas.microsoft.com/office/drawing/2016/5/10/chartex" xmlns:cx5="http://schemas.microsoft.com/office/drawing/2016/5/11/chartex" xmlns:cx6="http://schemas.microsoft.com/office/drawing/2016/5/12/chartex" xmlns:cx7="http://schemas.microsoft.com/office/drawing/2016/5/13/chartex" xmlns:cx8="http://schemas.microsoft.com/office/drawing/2016/5/14/chartex" xmlns:mc="http://schemas.openxmlformats.org/markup-compatibility/2006" xmlns:aink="http://schemas.microsoft.com/office/drawing/2016/ink" xmlns:am3d="http://schemas.microsoft.com/office/drawing/2017/model3d" xmlns:o="urn:schemas-microsoft-com:office:office" xmlns:oel="http://schemas.microsoft.com/office/2019/extlst" xmlns:r="http://schemas.openxmlformats.org/officeDocument/2006/relationships" xmlns:m="http://schemas.openxmlformats.org/officeDocument/2006/math" xmlns:v="urn:schemas-microsoft-com:vml" xmlns:wp14="http://schemas.microsoft.com/office/word/2010/wordprocessingDrawing" xmlns:wp="http://schemas.openxmlformats.org/drawingml/2006/wordprocessingDrawing" xmlns:w10="urn:schemas-microsoft-com:office:word" xmlns:w="http://schemas.openxmlformats.org/wordprocessingml/2006/main" xmlns:w14="http://schemas.microsoft.com/office/word/2010/wordml" xmlns:w15="http://schemas.microsoft.com/office/word/2012/wordml" xmlns:w16cex="http://schemas.microsoft.com/office/word/2018/wordml/cex" xmlns:w16cid="http://schemas.microsoft.com/office/word/2016/wordml/cid" xmlns:w16="http://schemas.microsoft.com/office/word/2018/wordml" xmlns:w16du="http://schemas.microsoft.com/office/word/2023/wordml/word16du" xmlns:w16sdtdh="http://schemas.microsoft.com/office/word/2020/wordml/sdtdatahash" xmlns:w16sdtfl="http://schemas.microsoft.com/office/word/2024/wordml/sdtformatlock" xmlns:w16se="http://schemas.microsoft.com/office/word/2015/wordml/symex" xmlns:wpg="http://schemas.microsoft.com/office/word/2010/wordprocessingGroup" xmlns:wpi="http://schemas.microsoft.com/office/word/2010/wordprocessingInk" xmlns:wne="http://schemas.microsoft.com/office/word/2006/wordml" xmlns:wps="http://schemas.microsoft.com/office/word/2010/wordprocessingShape" mc:Ignorable="w14 w15 w16se w16cid w16 w16cex w16sdtdh w16sdtfl w16du wp14">
+<w:footnotes xmlns:wpc="http://schemas.microsoft.com/office/word/2010/wordprocessingCanvas" xmlns:cx="http://schemas.microsoft.com/office/drawing/2014/chartex" xmlns:cx1="http://schemas.microsoft.com/office/drawing/2015/9/8/chartex" xmlns:cx2="http://schemas.microsoft.com/office/drawing/2015/10/21/chartex" xmlns:cx3="http://schemas.microsoft.com/office/drawing/2016/5/9/chartex" xmlns:cx4="http://schemas.microsoft.com/office/drawing/2016/5/10/chartex" xmlns:cx5="http://schemas.microsoft.com/office/drawing/2016/5/11/chartex" xmlns:cx6="http://schemas.microsoft.com/office/drawing/2016/5/12/chartex" xmlns:cx7="http://schemas.microsoft.com/office/drawing/2016/5/13/chartex" xmlns:cx8="http://schemas.microsoft.com/office/drawing/2016/5/14/chartex" xmlns:mc="http://schemas.openxmlformats.org/markup-compatibility/2006" xmlns:aink="http://schemas.microsoft.com/office/drawing/2016/ink" xmlns:am3d="http://schemas.microsoft.com/office/drawing/2017/model3d" xmlns:o="urn:schemas-microsoft-com:office:office" xmlns:r="http://schemas.openxmlformats.org/officeDocument/2006/relationships" xmlns:m="http://schemas.openxmlformats.org/officeDocument/2006/math" xmlns:v="urn:schemas-microsoft-com:vml" xmlns:wp14="http://schemas.microsoft.com/office/word/2010/wordprocessingDrawing" xmlns:wp="http://schemas.openxmlformats.org/drawingml/2006/wordprocessingDrawing" xmlns:w10="urn:schemas-microsoft-com:office:word" xmlns:w="http://schemas.openxmlformats.org/wordprocessingml/2006/main" xmlns:w14="http://schemas.microsoft.com/office/word/2010/wordml" xmlns:w15="http://schemas.microsoft.com/office/word/2012/wordml" xmlns:w16cex="http://schemas.microsoft.com/office/word/2018/wordml/cex" xmlns:w16cid="http://schemas.microsoft.com/office/word/2016/wordml/cid" xmlns:w16="http://schemas.microsoft.com/office/word/2018/wordml" xmlns:w16sdtdh="http://schemas.microsoft.com/office/word/2020/wordml/sdtdatahash" xmlns:w16se="http://schemas.microsoft.com/office/word/2015/wordml/symex" xmlns:wpg="http://schemas.microsoft.com/office/word/2010/wordprocessingGroup" xmlns:wpi="http://schemas.microsoft.com/office/word/2010/wordprocessingInk" xmlns:wne="http://schemas.microsoft.com/office/word/2006/wordml" xmlns:wps="http://schemas.microsoft.com/office/word/2010/wordprocessingShape" mc:Ignorable="w14 w15 w16se w16cid w16 w16cex w16sdtdh wp14">
   <w:footnote w:type="separator" w:id="-1">
     <w:p>
       <w:pPr>
@@ -3918,7 +4035,7 @@
 </file>
 
 <file path=word/numbering.xml><?xml version="1.0" encoding="utf-8"?>
-<w:numbering xmlns:wpc="http://schemas.microsoft.com/office/word/2010/wordprocessingCanvas" xmlns:cx="http://schemas.microsoft.com/office/drawing/2014/chartex" xmlns:cx1="http://schemas.microsoft.com/office/drawing/2015/9/8/chartex" xmlns:cx2="http://schemas.microsoft.com/office/drawing/2015/10/21/chartex" xmlns:cx3="http://schemas.microsoft.com/office/drawing/2016/5/9/chartex" xmlns:cx4="http://schemas.microsoft.com/office/drawing/2016/5/10/chartex" xmlns:cx5="http://schemas.microsoft.com/office/drawing/2016/5/11/chartex" xmlns:cx6="http://schemas.microsoft.com/office/drawing/2016/5/12/chartex" xmlns:cx7="http://schemas.microsoft.com/office/drawing/2016/5/13/chartex" xmlns:cx8="http://schemas.microsoft.com/office/drawing/2016/5/14/chartex" xmlns:mc="http://schemas.openxmlformats.org/markup-compatibility/2006" xmlns:aink="http://schemas.microsoft.com/office/drawing/2016/ink" xmlns:am3d="http://schemas.microsoft.com/office/drawing/2017/model3d" xmlns:o="urn:schemas-microsoft-com:office:office" xmlns:oel="http://schemas.microsoft.com/office/2019/extlst" xmlns:r="http://schemas.openxmlformats.org/officeDocument/2006/relationships" xmlns:m="http://schemas.openxmlformats.org/officeDocument/2006/math" xmlns:v="urn:schemas-microsoft-com:vml" xmlns:wp14="http://schemas.microsoft.com/office/word/2010/wordprocessingDrawing" xmlns:wp="http://schemas.openxmlformats.org/drawingml/2006/wordprocessingDrawing" xmlns:w10="urn:schemas-microsoft-com:office:word" xmlns:w="http://schemas.openxmlformats.org/wordprocessingml/2006/main" xmlns:w14="http://schemas.microsoft.com/office/word/2010/wordml" xmlns:w15="http://schemas.microsoft.com/office/word/2012/wordml" xmlns:w16cex="http://schemas.microsoft.com/office/word/2018/wordml/cex" xmlns:w16cid="http://schemas.microsoft.com/office/word/2016/wordml/cid" xmlns:w16="http://schemas.microsoft.com/office/word/2018/wordml" xmlns:w16du="http://schemas.microsoft.com/office/word/2023/wordml/word16du" xmlns:w16sdtdh="http://schemas.microsoft.com/office/word/2020/wordml/sdtdatahash" xmlns:w16sdtfl="http://schemas.microsoft.com/office/word/2024/wordml/sdtformatlock" xmlns:w16se="http://schemas.microsoft.com/office/word/2015/wordml/symex" xmlns:wpg="http://schemas.microsoft.com/office/word/2010/wordprocessingGroup" xmlns:wpi="http://schemas.microsoft.com/office/word/2010/wordprocessingInk" xmlns:wne="http://schemas.microsoft.com/office/word/2006/wordml" xmlns:wps="http://schemas.microsoft.com/office/word/2010/wordprocessingShape" mc:Ignorable="w14 w15 w16se w16cid w16 w16cex w16sdtdh w16sdtfl w16du wp14">
+<w:numbering xmlns:wpc="http://schemas.microsoft.com/office/word/2010/wordprocessingCanvas" xmlns:cx="http://schemas.microsoft.com/office/drawing/2014/chartex" xmlns:cx1="http://schemas.microsoft.com/office/drawing/2015/9/8/chartex" xmlns:cx2="http://schemas.microsoft.com/office/drawing/2015/10/21/chartex" xmlns:cx3="http://schemas.microsoft.com/office/drawing/2016/5/9/chartex" xmlns:cx4="http://schemas.microsoft.com/office/drawing/2016/5/10/chartex" xmlns:cx5="http://schemas.microsoft.com/office/drawing/2016/5/11/chartex" xmlns:cx6="http://schemas.microsoft.com/office/drawing/2016/5/12/chartex" xmlns:cx7="http://schemas.microsoft.com/office/drawing/2016/5/13/chartex" xmlns:cx8="http://schemas.microsoft.com/office/drawing/2016/5/14/chartex" xmlns:mc="http://schemas.openxmlformats.org/markup-compatibility/2006" xmlns:aink="http://schemas.microsoft.com/office/drawing/2016/ink" xmlns:am3d="http://schemas.microsoft.com/office/drawing/2017/model3d" xmlns:o="urn:schemas-microsoft-com:office:office" xmlns:r="http://schemas.openxmlformats.org/officeDocument/2006/relationships" xmlns:m="http://schemas.openxmlformats.org/officeDocument/2006/math" xmlns:v="urn:schemas-microsoft-com:vml" xmlns:wp14="http://schemas.microsoft.com/office/word/2010/wordprocessingDrawing" xmlns:wp="http://schemas.openxmlformats.org/drawingml/2006/wordprocessingDrawing" xmlns:w10="urn:schemas-microsoft-com:office:word" xmlns:w="http://schemas.openxmlformats.org/wordprocessingml/2006/main" xmlns:w14="http://schemas.microsoft.com/office/word/2010/wordml" xmlns:w15="http://schemas.microsoft.com/office/word/2012/wordml" xmlns:w16cex="http://schemas.microsoft.com/office/word/2018/wordml/cex" xmlns:w16cid="http://schemas.microsoft.com/office/word/2016/wordml/cid" xmlns:w16="http://schemas.microsoft.com/office/word/2018/wordml" xmlns:w16sdtdh="http://schemas.microsoft.com/office/word/2020/wordml/sdtdatahash" xmlns:w16se="http://schemas.microsoft.com/office/word/2015/wordml/symex" xmlns:wpg="http://schemas.microsoft.com/office/word/2010/wordprocessingGroup" xmlns:wpi="http://schemas.microsoft.com/office/word/2010/wordprocessingInk" xmlns:wne="http://schemas.microsoft.com/office/word/2006/wordml" xmlns:wps="http://schemas.microsoft.com/office/word/2010/wordprocessingShape" mc:Ignorable="w14 w15 w16se w16cid w16 w16cex w16sdtdh wp14">
   <w:abstractNum w:abstractNumId="0" w15:restartNumberingAfterBreak="0">
     <w:nsid w:val="FFFFFF7C"/>
     <w:multiLevelType w:val="singleLevel"/>
@@ -4881,59 +4998,59 @@
       </w:rPr>
     </w:lvl>
   </w:abstractNum>
-  <w:num w:numId="1" w16cid:durableId="235017817">
+  <w:num w:numId="1">
     <w:abstractNumId w:val="8"/>
   </w:num>
-  <w:num w:numId="2" w16cid:durableId="1262839343">
+  <w:num w:numId="2">
     <w:abstractNumId w:val="6"/>
   </w:num>
-  <w:num w:numId="3" w16cid:durableId="1072772713">
+  <w:num w:numId="3">
     <w:abstractNumId w:val="5"/>
   </w:num>
-  <w:num w:numId="4" w16cid:durableId="469977749">
+  <w:num w:numId="4">
     <w:abstractNumId w:val="4"/>
   </w:num>
-  <w:num w:numId="5" w16cid:durableId="1595165539">
+  <w:num w:numId="5">
     <w:abstractNumId w:val="7"/>
   </w:num>
-  <w:num w:numId="6" w16cid:durableId="1390881922">
+  <w:num w:numId="6">
     <w:abstractNumId w:val="3"/>
   </w:num>
-  <w:num w:numId="7" w16cid:durableId="2084255720">
+  <w:num w:numId="7">
     <w:abstractNumId w:val="2"/>
   </w:num>
-  <w:num w:numId="8" w16cid:durableId="1005939872">
+  <w:num w:numId="8">
     <w:abstractNumId w:val="1"/>
   </w:num>
-  <w:num w:numId="9" w16cid:durableId="278267688">
+  <w:num w:numId="9">
     <w:abstractNumId w:val="0"/>
   </w:num>
-  <w:num w:numId="10" w16cid:durableId="2121602060">
+  <w:num w:numId="10">
     <w:abstractNumId w:val="12"/>
   </w:num>
-  <w:num w:numId="11" w16cid:durableId="209733942">
+  <w:num w:numId="11">
     <w:abstractNumId w:val="13"/>
   </w:num>
-  <w:num w:numId="12" w16cid:durableId="554045905">
+  <w:num w:numId="12">
     <w:abstractNumId w:val="11"/>
   </w:num>
-  <w:num w:numId="13" w16cid:durableId="132144915">
+  <w:num w:numId="13">
     <w:abstractNumId w:val="9"/>
   </w:num>
-  <w:num w:numId="14" w16cid:durableId="2088648174">
+  <w:num w:numId="14">
     <w:abstractNumId w:val="10"/>
   </w:num>
-  <w:num w:numId="15" w16cid:durableId="1744182596">
+  <w:num w:numId="15">
     <w:abstractNumId w:val="14"/>
   </w:num>
-  <w:num w:numId="16" w16cid:durableId="1802116093">
+  <w:num w:numId="16">
     <w:abstractNumId w:val="15"/>
   </w:num>
 </w:numbering>
 </file>
 
 <file path=word/styles.xml><?xml version="1.0" encoding="utf-8"?>
-<w:styles xmlns:mc="http://schemas.openxmlformats.org/markup-compatibility/2006" xmlns:r="http://schemas.openxmlformats.org/officeDocument/2006/relationships" xmlns:w="http://schemas.openxmlformats.org/wordprocessingml/2006/main" xmlns:w14="http://schemas.microsoft.com/office/word/2010/wordml" xmlns:w15="http://schemas.microsoft.com/office/word/2012/wordml" xmlns:w16cex="http://schemas.microsoft.com/office/word/2018/wordml/cex" xmlns:w16cid="http://schemas.microsoft.com/office/word/2016/wordml/cid" xmlns:w16="http://schemas.microsoft.com/office/word/2018/wordml" xmlns:w16du="http://schemas.microsoft.com/office/word/2023/wordml/word16du" xmlns:w16sdtdh="http://schemas.microsoft.com/office/word/2020/wordml/sdtdatahash" xmlns:w16sdtfl="http://schemas.microsoft.com/office/word/2024/wordml/sdtformatlock" xmlns:w16se="http://schemas.microsoft.com/office/word/2015/wordml/symex" mc:Ignorable="w14 w15 w16se w16cid w16 w16cex w16sdtdh w16sdtfl w16du">
+<w:styles xmlns:mc="http://schemas.openxmlformats.org/markup-compatibility/2006" xmlns:r="http://schemas.openxmlformats.org/officeDocument/2006/relationships" xmlns:w="http://schemas.openxmlformats.org/wordprocessingml/2006/main" xmlns:w14="http://schemas.microsoft.com/office/word/2010/wordml" xmlns:w15="http://schemas.microsoft.com/office/word/2012/wordml" xmlns:w16cex="http://schemas.microsoft.com/office/word/2018/wordml/cex" xmlns:w16cid="http://schemas.microsoft.com/office/word/2016/wordml/cid" xmlns:w16="http://schemas.microsoft.com/office/word/2018/wordml" xmlns:w16sdtdh="http://schemas.microsoft.com/office/word/2020/wordml/sdtdatahash" xmlns:w16se="http://schemas.microsoft.com/office/word/2015/wordml/symex" mc:Ignorable="w14 w15 w16se w16cid w16 w16cex w16sdtdh">
   <w:docDefaults>
     <w:rPrDefault>
       <w:rPr>

</xml_diff>

<commit_message>
fix: add phone number, email, and job title to DOCX report placeholders
</commit_message>
<xml_diff>
--- a/EECA Compliance Readiness Preliminary Report.docx
+++ b/EECA Compliance Readiness Preliminary Report.docx
@@ -256,7 +256,7 @@
                 <w:rFonts w:asciiTheme="majorHAnsi" w:hAnsiTheme="majorHAnsi" w:cstheme="majorHAnsi"/>
                 <w:b/>
               </w:rPr>
-              <w:t>Respondent</w:t>
+              <w:t>Prepared By</w:t>
             </w:r>
           </w:p>
         </w:tc>
@@ -275,7 +275,7 @@
               <w:rPr>
                 <w:rFonts w:asciiTheme="majorHAnsi" w:hAnsiTheme="majorHAnsi" w:cstheme="majorHAnsi"/>
               </w:rPr>
-              <w:t>[Respondent Name], [Designation]</w:t>
+              <w:t>Sandhurst Advisory</w:t>
             </w:r>
           </w:p>
         </w:tc>
@@ -290,6 +290,7 @@
               <w:ind w:left="180"/>
               <w:rPr>
                 <w:rFonts w:asciiTheme="majorHAnsi" w:hAnsiTheme="majorHAnsi" w:cstheme="majorHAnsi"/>
+                <w:b/>
               </w:rPr>
             </w:pPr>
             <w:r>
@@ -297,7 +298,7 @@
                 <w:rFonts w:asciiTheme="majorHAnsi" w:hAnsiTheme="majorHAnsi" w:cstheme="majorHAnsi"/>
                 <w:b/>
               </w:rPr>
-              <w:t>Facility / Plant</w:t>
+              <w:t>Email</w:t>
             </w:r>
           </w:p>
         </w:tc>
@@ -316,7 +317,19 @@
               <w:rPr>
                 <w:rFonts w:asciiTheme="majorHAnsi" w:hAnsiTheme="majorHAnsi" w:cstheme="majorHAnsi"/>
               </w:rPr>
-              <w:t>[Facility Name]</w:t>
+              <w:t>[</w:t>
+            </w:r>
+            <w:r>
+              <w:rPr>
+                <w:rFonts w:asciiTheme="majorHAnsi" w:hAnsiTheme="majorHAnsi" w:cstheme="majorHAnsi"/>
+              </w:rPr>
+              <w:t>Email</w:t>
+            </w:r>
+            <w:r>
+              <w:rPr>
+                <w:rFonts w:asciiTheme="majorHAnsi" w:hAnsiTheme="majorHAnsi" w:cstheme="majorHAnsi"/>
+              </w:rPr>
+              <w:t>]</w:t>
             </w:r>
           </w:p>
         </w:tc>
@@ -331,6 +344,7 @@
               <w:ind w:left="180"/>
               <w:rPr>
                 <w:rFonts w:asciiTheme="majorHAnsi" w:hAnsiTheme="majorHAnsi" w:cstheme="majorHAnsi"/>
+                <w:b/>
               </w:rPr>
             </w:pPr>
             <w:r>
@@ -338,7 +352,7 @@
                 <w:rFonts w:asciiTheme="majorHAnsi" w:hAnsiTheme="majorHAnsi" w:cstheme="majorHAnsi"/>
                 <w:b/>
               </w:rPr>
-              <w:t>Prepared By</w:t>
+              <w:t>Phone No</w:t>
             </w:r>
           </w:p>
         </w:tc>
@@ -357,7 +371,61 @@
               <w:rPr>
                 <w:rFonts w:asciiTheme="majorHAnsi" w:hAnsiTheme="majorHAnsi" w:cstheme="majorHAnsi"/>
               </w:rPr>
-              <w:t>Sandhurst Advisory</w:t>
+              <w:t>[</w:t>
+            </w:r>
+            <w:r>
+              <w:rPr>
+                <w:rFonts w:asciiTheme="majorHAnsi" w:hAnsiTheme="majorHAnsi" w:cstheme="majorHAnsi"/>
+              </w:rPr>
+              <w:t>Phone No</w:t>
+            </w:r>
+            <w:r>
+              <w:rPr>
+                <w:rFonts w:asciiTheme="majorHAnsi" w:hAnsiTheme="majorHAnsi" w:cstheme="majorHAnsi"/>
+              </w:rPr>
+              <w:t>]</w:t>
+            </w:r>
+          </w:p>
+        </w:tc>
+      </w:tr>
+      <w:tr>
+        <w:tc>
+          <w:tcPr>
+            <w:tcW w:w="4320" w:type="dxa"/>
+          </w:tcPr>
+          <w:p>
+            <w:pPr>
+              <w:ind w:left="180"/>
+              <w:rPr>
+                <w:rFonts w:asciiTheme="majorHAnsi" w:hAnsiTheme="majorHAnsi" w:cstheme="majorHAnsi"/>
+                <w:b/>
+              </w:rPr>
+            </w:pPr>
+            <w:r>
+              <w:rPr>
+                <w:rFonts w:asciiTheme="majorHAnsi" w:hAnsiTheme="majorHAnsi" w:cstheme="majorHAnsi"/>
+                <w:b/>
+              </w:rPr>
+              <w:t>Job Title</w:t>
+            </w:r>
+          </w:p>
+        </w:tc>
+        <w:tc>
+          <w:tcPr>
+            <w:tcW w:w="4320" w:type="dxa"/>
+          </w:tcPr>
+          <w:p>
+            <w:pPr>
+              <w:ind w:left="180"/>
+              <w:rPr>
+                <w:rFonts w:asciiTheme="majorHAnsi" w:hAnsiTheme="majorHAnsi" w:cstheme="majorHAnsi"/>
+              </w:rPr>
+            </w:pPr>
+            <w:r>
+              <w:rPr>
+                <w:rFonts w:asciiTheme="majorHAnsi" w:hAnsiTheme="majorHAnsi" w:cstheme="majorHAnsi"/>
+              </w:rPr>
+              <w:t>[Job Title]</w:t>
             </w:r>
           </w:p>
         </w:tc>
@@ -480,6 +548,7 @@
           <w:rFonts w:asciiTheme="majorHAnsi" w:hAnsiTheme="majorHAnsi" w:cstheme="majorHAnsi"/>
           <w:noProof/>
         </w:rPr>
+        <w:lastRenderedPageBreak/>
         <w:drawing>
           <wp:anchor distT="0" distB="0" distL="114300" distR="114300" simplePos="0" relativeHeight="251660288" behindDoc="0" locked="0" layoutInCell="1" allowOverlap="1" wp14:anchorId="63BFF9BF" wp14:editId="63CA13FF">
             <wp:simplePos x="0" y="0"/>
@@ -562,7 +631,6 @@
           <w:rFonts w:cstheme="majorHAnsi"/>
           <w:color w:val="548DD4" w:themeColor="text2" w:themeTint="99"/>
         </w:rPr>
-        <w:lastRenderedPageBreak/>
         <w:t>1. Executive Summary</w:t>
       </w:r>
     </w:p>
@@ -581,23 +649,7 @@
           <w:sz w:val="21"/>
           <w:szCs w:val="21"/>
         </w:rPr>
-        <w:t xml:space="preserve">This Preliminary Assessment Report provides a </w:t>
-      </w:r>
-      <w:r>
-        <w:rPr>
-          <w:rFonts w:asciiTheme="majorHAnsi" w:hAnsiTheme="majorHAnsi" w:cstheme="majorHAnsi"/>
-          <w:sz w:val="21"/>
-          <w:szCs w:val="21"/>
-        </w:rPr>
-        <w:t>high-level overview of your facility's current readiness position concerning the upcoming requirements of the Energy Efficiency and Conservation Act (EECA). The analysis is derived from the self-reported parameters provided during the EECA Compliance &amp; Rea</w:t>
-      </w:r>
-      <w:r>
-        <w:rPr>
-          <w:rFonts w:asciiTheme="majorHAnsi" w:hAnsiTheme="majorHAnsi" w:cstheme="majorHAnsi"/>
-          <w:sz w:val="21"/>
-          <w:szCs w:val="21"/>
-        </w:rPr>
-        <w:t>diness Checklist assessment.</w:t>
+        <w:t>This Preliminary Assessment Report provides a high-level overview of your facility's current readiness position concerning the upcoming requirements of the Energy Efficiency and Conservation Act (EECA). The analysis is derived from the self-reported parameters provided during the EECA Compliance &amp; Readiness Checklist assessment.</w:t>
       </w:r>
     </w:p>
     <w:tbl>
@@ -836,8 +888,9 @@
           <w:sz w:val="21"/>
           <w:szCs w:val="21"/>
         </w:rPr>
-        <w:t>Your facility demonstrates a baseline understanding of the EECA requirements with certain elements already initiated. However, critical structural gaps remain in formal data readiness, systemic Energy Management System (EnMS) deployment, and definitive aud</w:t>
+        <w:t>Your facility demonstrates a baseline understanding of the EECA requirements with certain elements already initiated. However, critical structural gaps remain in formal data readiness, systemic Energy Management System (</w:t>
       </w:r>
+      <w:proofErr w:type="spellStart"/>
       <w:r>
         <w:rPr>
           <w:rFonts w:asciiTheme="majorHAnsi" w:hAnsiTheme="majorHAnsi" w:cstheme="majorHAnsi"/>
@@ -845,7 +898,17 @@
           <w:sz w:val="21"/>
           <w:szCs w:val="21"/>
         </w:rPr>
-        <w:t xml:space="preserve">it </w:t>
+        <w:t>EnMS</w:t>
+      </w:r>
+      <w:proofErr w:type="spellEnd"/>
+      <w:r>
+        <w:rPr>
+          <w:rFonts w:asciiTheme="majorHAnsi" w:hAnsiTheme="majorHAnsi" w:cstheme="majorHAnsi"/>
+          <w:color w:val="4F81BD" w:themeColor="accent1"/>
+          <w:sz w:val="21"/>
+          <w:szCs w:val="21"/>
+        </w:rPr>
+        <w:t xml:space="preserve">) deployment, and definitive audit </w:t>
       </w:r>
       <w:r>
         <w:rPr>
@@ -1191,12 +1254,21 @@
                 <w:color w:val="000000" w:themeColor="text1"/>
               </w:rPr>
             </w:pPr>
+            <w:proofErr w:type="spellStart"/>
             <w:r>
               <w:rPr>
                 <w:rFonts w:asciiTheme="majorHAnsi" w:hAnsiTheme="majorHAnsi" w:cstheme="majorHAnsi"/>
                 <w:color w:val="000000" w:themeColor="text1"/>
               </w:rPr>
-              <w:t>EnMS Status</w:t>
+              <w:t>EnMS</w:t>
+            </w:r>
+            <w:proofErr w:type="spellEnd"/>
+            <w:r>
+              <w:rPr>
+                <w:rFonts w:asciiTheme="majorHAnsi" w:hAnsiTheme="majorHAnsi" w:cstheme="majorHAnsi"/>
+                <w:color w:val="000000" w:themeColor="text1"/>
+              </w:rPr>
+              <w:t xml:space="preserve"> Status</w:t>
             </w:r>
           </w:p>
         </w:tc>
@@ -1252,12 +1324,21 @@
                 <w:color w:val="000000" w:themeColor="text1"/>
               </w:rPr>
             </w:pPr>
+            <w:proofErr w:type="spellStart"/>
             <w:r>
               <w:rPr>
                 <w:rFonts w:asciiTheme="majorHAnsi" w:hAnsiTheme="majorHAnsi" w:cstheme="majorHAnsi"/>
                 <w:color w:val="000000" w:themeColor="text1"/>
               </w:rPr>
-              <w:t>EnMS Elements in Place</w:t>
+              <w:t>EnMS</w:t>
+            </w:r>
+            <w:proofErr w:type="spellEnd"/>
+            <w:r>
+              <w:rPr>
+                <w:rFonts w:asciiTheme="majorHAnsi" w:hAnsiTheme="majorHAnsi" w:cstheme="majorHAnsi"/>
+                <w:color w:val="000000" w:themeColor="text1"/>
+              </w:rPr>
+              <w:t xml:space="preserve"> Elements in Place</w:t>
             </w:r>
           </w:p>
         </w:tc>
@@ -1304,12 +1385,22 @@
                 <w:color w:val="000000" w:themeColor="text1"/>
               </w:rPr>
             </w:pPr>
+            <w:proofErr w:type="spellStart"/>
             <w:r>
               <w:rPr>
                 <w:rFonts w:asciiTheme="majorHAnsi" w:hAnsiTheme="majorHAnsi" w:cstheme="majorHAnsi"/>
                 <w:color w:val="000000" w:themeColor="text1"/>
               </w:rPr>
-              <w:t>EnMS Activities in Place</w:t>
+              <w:lastRenderedPageBreak/>
+              <w:t>EnMS</w:t>
+            </w:r>
+            <w:proofErr w:type="spellEnd"/>
+            <w:r>
+              <w:rPr>
+                <w:rFonts w:asciiTheme="majorHAnsi" w:hAnsiTheme="majorHAnsi" w:cstheme="majorHAnsi"/>
+                <w:color w:val="000000" w:themeColor="text1"/>
+              </w:rPr>
+              <w:t xml:space="preserve"> Activities in Place</w:t>
             </w:r>
           </w:p>
         </w:tc>
@@ -1360,7 +1451,6 @@
                 <w:rFonts w:asciiTheme="majorHAnsi" w:hAnsiTheme="majorHAnsi" w:cstheme="majorHAnsi"/>
                 <w:color w:val="000000" w:themeColor="text1"/>
               </w:rPr>
-              <w:lastRenderedPageBreak/>
               <w:t>EE&amp;C Report Readiness</w:t>
             </w:r>
           </w:p>
@@ -1541,15 +1631,7 @@
           <w:sz w:val="21"/>
           <w:szCs w:val="21"/>
         </w:rPr>
-        <w:t xml:space="preserve">A Registered Energy Manager (REM) has not yet been formally </w:t>
-      </w:r>
-      <w:r>
-        <w:rPr>
-          <w:rFonts w:asciiTheme="majorHAnsi" w:hAnsiTheme="majorHAnsi" w:cstheme="majorHAnsi"/>
-          <w:sz w:val="21"/>
-          <w:szCs w:val="21"/>
-        </w:rPr>
-        <w:t>appointed.</w:t>
+        <w:t>A Registered Energy Manager (REM) has not yet been formally appointed.</w:t>
       </w:r>
     </w:p>
     <w:p>
@@ -1617,7 +1699,25 @@
           <w:sz w:val="21"/>
           <w:szCs w:val="21"/>
         </w:rPr>
-        <w:t>The Energy Management System (EnMS) is not yet fully established across all required levels.</w:t>
+        <w:t>The Energy Management System (</w:t>
+      </w:r>
+      <w:proofErr w:type="spellStart"/>
+      <w:r>
+        <w:rPr>
+          <w:rFonts w:asciiTheme="majorHAnsi" w:hAnsiTheme="majorHAnsi" w:cstheme="majorHAnsi"/>
+          <w:sz w:val="21"/>
+          <w:szCs w:val="21"/>
+        </w:rPr>
+        <w:t>EnMS</w:t>
+      </w:r>
+      <w:proofErr w:type="spellEnd"/>
+      <w:r>
+        <w:rPr>
+          <w:rFonts w:asciiTheme="majorHAnsi" w:hAnsiTheme="majorHAnsi" w:cstheme="majorHAnsi"/>
+          <w:sz w:val="21"/>
+          <w:szCs w:val="21"/>
+        </w:rPr>
+        <w:t>) is not yet fully established across all required levels.</w:t>
       </w:r>
     </w:p>
     <w:p>
@@ -1649,14 +1749,7 @@
           <w:color w:val="548DD4" w:themeColor="text2" w:themeTint="99"/>
         </w:rPr>
         <w:lastRenderedPageBreak/>
-        <w:t xml:space="preserve">3. </w:t>
-      </w:r>
-      <w:r>
-        <w:rPr>
-          <w:rFonts w:cstheme="majorHAnsi"/>
-          <w:color w:val="548DD4" w:themeColor="text2" w:themeTint="99"/>
-        </w:rPr>
-        <w:t>Indicative EECA Compliance Timeline</w:t>
+        <w:t>3. Indicative EECA Compliance Timeline</w:t>
       </w:r>
     </w:p>
     <w:p>
@@ -1778,14 +1871,7 @@
           <w:color w:val="4F81BD" w:themeColor="accent1"/>
         </w:rPr>
         <w:lastRenderedPageBreak/>
-        <w:t>4. Recommendation of</w:t>
-      </w:r>
-      <w:r>
-        <w:rPr>
-          <w:rFonts w:cstheme="majorHAnsi"/>
-          <w:color w:val="4F81BD" w:themeColor="accent1"/>
-        </w:rPr>
-        <w:t xml:space="preserve"> Implementation Actions</w:t>
+        <w:t>4. Recommendation of Implementation Actions</w:t>
       </w:r>
     </w:p>
     <w:p>
@@ -1803,15 +1889,7 @@
           <w:sz w:val="21"/>
           <w:szCs w:val="21"/>
         </w:rPr>
-        <w:t>To bridge the compliance gaps identified in your self-assessment, the following framework categorizes the mandatory EECA requirements. Your facility's engineering and management teams may utilize this structured workspace to outline</w:t>
-      </w:r>
-      <w:r>
-        <w:rPr>
-          <w:rFonts w:asciiTheme="majorHAnsi" w:hAnsiTheme="majorHAnsi" w:cstheme="majorHAnsi"/>
-          <w:sz w:val="21"/>
-          <w:szCs w:val="21"/>
-        </w:rPr>
-        <w:t xml:space="preserve"> specific, assignable action plans.</w:t>
+        <w:t>To bridge the compliance gaps identified in your self-assessment, the following framework categorizes the mandatory EECA requirements. Your facility's engineering and management teams may utilize this structured workspace to outline specific, assignable action plans.</w:t>
       </w:r>
       <w:r>
         <w:rPr>
@@ -2038,7 +2116,21 @@
               <w:rPr>
                 <w:rFonts w:asciiTheme="majorHAnsi" w:hAnsiTheme="majorHAnsi" w:cstheme="majorHAnsi"/>
               </w:rPr>
-              <w:t>B. EnMS Establishment</w:t>
+              <w:t xml:space="preserve">B. </w:t>
+            </w:r>
+            <w:proofErr w:type="spellStart"/>
+            <w:r>
+              <w:rPr>
+                <w:rFonts w:asciiTheme="majorHAnsi" w:hAnsiTheme="majorHAnsi" w:cstheme="majorHAnsi"/>
+              </w:rPr>
+              <w:t>EnMS</w:t>
+            </w:r>
+            <w:proofErr w:type="spellEnd"/>
+            <w:r>
+              <w:rPr>
+                <w:rFonts w:asciiTheme="majorHAnsi" w:hAnsiTheme="majorHAnsi" w:cstheme="majorHAnsi"/>
+              </w:rPr>
+              <w:t xml:space="preserve"> Establishment</w:t>
             </w:r>
           </w:p>
         </w:tc>
@@ -2058,13 +2150,7 @@
               <w:rPr>
                 <w:rFonts w:asciiTheme="majorHAnsi" w:hAnsiTheme="majorHAnsi" w:cstheme="majorHAnsi"/>
               </w:rPr>
-              <w:t xml:space="preserve">[Auto-filled] e.g., Partial </w:t>
-            </w:r>
-            <w:r>
-              <w:rPr>
-                <w:rFonts w:asciiTheme="majorHAnsi" w:hAnsiTheme="majorHAnsi" w:cstheme="majorHAnsi"/>
-              </w:rPr>
-              <w:t>policies.</w:t>
+              <w:t>[Auto-filled] e.g., Partial policies.</w:t>
             </w:r>
           </w:p>
         </w:tc>
@@ -2756,7 +2842,21 @@
               <w:rPr>
                 <w:rFonts w:cstheme="majorHAnsi"/>
               </w:rPr>
-              <w:t>C. Energy Management System (EnMS)</w:t>
+              <w:t>C. Energy Management System (</w:t>
+            </w:r>
+            <w:proofErr w:type="spellStart"/>
+            <w:r>
+              <w:rPr>
+                <w:rFonts w:cstheme="majorHAnsi"/>
+              </w:rPr>
+              <w:t>EnMS</w:t>
+            </w:r>
+            <w:proofErr w:type="spellEnd"/>
+            <w:r>
+              <w:rPr>
+                <w:rFonts w:cstheme="majorHAnsi"/>
+              </w:rPr>
+              <w:t>)</w:t>
             </w:r>
           </w:p>
         </w:tc>
@@ -2786,7 +2886,23 @@
                 <w:color w:val="000000" w:themeColor="text1"/>
               </w:rPr>
               <w:lastRenderedPageBreak/>
-              <w:t>An applicable energy consumer must systematically develop and integrate an EnMS into their daily operations. The EECA aligns closely with the continuous improvement framework (such as ISO 50001), strictly requiring:</w:t>
+              <w:t xml:space="preserve">An applicable energy consumer must systematically develop and integrate an </w:t>
+            </w:r>
+            <w:proofErr w:type="spellStart"/>
+            <w:r>
+              <w:rPr>
+                <w:rFonts w:cstheme="majorHAnsi"/>
+                <w:color w:val="000000" w:themeColor="text1"/>
+              </w:rPr>
+              <w:t>EnMS</w:t>
+            </w:r>
+            <w:proofErr w:type="spellEnd"/>
+            <w:r>
+              <w:rPr>
+                <w:rFonts w:cstheme="majorHAnsi"/>
+                <w:color w:val="000000" w:themeColor="text1"/>
+              </w:rPr>
+              <w:t xml:space="preserve"> into their daily operations. The EECA aligns closely with the continuous improvement framework (such as ISO 50001), strictly requiring:</w:t>
             </w:r>
           </w:p>
           <w:p>
@@ -2830,7 +2946,23 @@
                 <w:rFonts w:cstheme="majorHAnsi"/>
                 <w:color w:val="000000" w:themeColor="text1"/>
               </w:rPr>
-              <w:t>Energy Planning &amp; Baselines: Identifying Significant Energy Uses (SEUs), establishing a valid 12-month energy consumption baseline, and setting quantifiable Energy Performance Indicators (EnPIs) and reduction targets.</w:t>
+              <w:t>Energy Planning &amp; Baselines: Identifying Significant Energy Uses (SEUs), establishing a valid 12-month energy consumption baseline, and setting quantifiable Energy Performance Indicators (</w:t>
+            </w:r>
+            <w:proofErr w:type="spellStart"/>
+            <w:r>
+              <w:rPr>
+                <w:rFonts w:cstheme="majorHAnsi"/>
+                <w:color w:val="000000" w:themeColor="text1"/>
+              </w:rPr>
+              <w:t>EnPIs</w:t>
+            </w:r>
+            <w:proofErr w:type="spellEnd"/>
+            <w:r>
+              <w:rPr>
+                <w:rFonts w:cstheme="majorHAnsi"/>
+                <w:color w:val="000000" w:themeColor="text1"/>
+              </w:rPr>
+              <w:t>) and reduction targets.</w:t>
             </w:r>
           </w:p>
           <w:p>
@@ -2874,7 +3006,23 @@
                 <w:rFonts w:cstheme="majorHAnsi"/>
                 <w:color w:val="000000" w:themeColor="text1"/>
               </w:rPr>
-              <w:t>Measurement &amp; Verification (M&amp;V): Deployment of continuous, real-time, or highl structured periodic monitoring of energy consumption to track progress against set targets.</w:t>
+              <w:t xml:space="preserve">Measurement &amp; Verification (M&amp;V): Deployment of continuous, real-time, or </w:t>
+            </w:r>
+            <w:proofErr w:type="spellStart"/>
+            <w:r>
+              <w:rPr>
+                <w:rFonts w:cstheme="majorHAnsi"/>
+                <w:color w:val="000000" w:themeColor="text1"/>
+              </w:rPr>
+              <w:t>highl</w:t>
+            </w:r>
+            <w:proofErr w:type="spellEnd"/>
+            <w:r>
+              <w:rPr>
+                <w:rFonts w:cstheme="majorHAnsi"/>
+                <w:color w:val="000000" w:themeColor="text1"/>
+              </w:rPr>
+              <w:t xml:space="preserve"> structured periodic monitoring of energy consumption to track progress against set targets.</w:t>
             </w:r>
           </w:p>
           <w:p>
@@ -3147,7 +3295,23 @@
                 <w:rFonts w:cstheme="majorHAnsi"/>
                 <w:color w:val="000000" w:themeColor="text1"/>
               </w:rPr>
-              <w:t>Detailed status of the EnMS implementation, energy policy updates, and progress of the</w:t>
+              <w:t xml:space="preserve">Detailed status of the </w:t>
+            </w:r>
+            <w:proofErr w:type="spellStart"/>
+            <w:r>
+              <w:rPr>
+                <w:rFonts w:cstheme="majorHAnsi"/>
+                <w:color w:val="000000" w:themeColor="text1"/>
+              </w:rPr>
+              <w:t>EnMS</w:t>
+            </w:r>
+            <w:proofErr w:type="spellEnd"/>
+            <w:r>
+              <w:rPr>
+                <w:rFonts w:cstheme="majorHAnsi"/>
+                <w:color w:val="000000" w:themeColor="text1"/>
+              </w:rPr>
+              <w:t xml:space="preserve"> implementation, energy policy updates, and progress of the</w:t>
             </w:r>
             <w:r>
               <w:rPr>
@@ -3633,41 +3797,25 @@
           <w:sz w:val="21"/>
           <w:szCs w:val="21"/>
         </w:rPr>
-        <w:t>Achieving compliance under the Energy Efficienc</w:t>
+        <w:t>Achieving compliance under the Energy Efficiency and Conservation Act (EECA) can be complex, but you do not have to navigate it alone. Sandhurst Advisory is ready to support your organization through every step of your EECA compliance journey.</w:t>
       </w:r>
+    </w:p>
+    <w:p>
+      <w:pPr>
+        <w:ind w:left="180"/>
+        <w:rPr>
+          <w:rFonts w:asciiTheme="majorHAnsi" w:hAnsiTheme="majorHAnsi" w:cstheme="majorHAnsi"/>
+          <w:sz w:val="21"/>
+          <w:szCs w:val="21"/>
+        </w:rPr>
+      </w:pPr>
       <w:r>
         <w:rPr>
           <w:rFonts w:asciiTheme="majorHAnsi" w:hAnsiTheme="majorHAnsi" w:cstheme="majorHAnsi"/>
           <w:sz w:val="21"/>
           <w:szCs w:val="21"/>
         </w:rPr>
-        <w:t>y and Conservation Act (EECA) can be complex, but you do not have to navigate it alone. Sandhurst Advisory is ready to support your organization through every step of your EECA compliance journey.</w:t>
-      </w:r>
-    </w:p>
-    <w:p>
-      <w:pPr>
-        <w:ind w:left="180"/>
-        <w:rPr>
-          <w:rFonts w:asciiTheme="majorHAnsi" w:hAnsiTheme="majorHAnsi" w:cstheme="majorHAnsi"/>
-          <w:sz w:val="21"/>
-          <w:szCs w:val="21"/>
-        </w:rPr>
-      </w:pPr>
-      <w:r>
-        <w:rPr>
-          <w:rFonts w:asciiTheme="majorHAnsi" w:hAnsiTheme="majorHAnsi" w:cstheme="majorHAnsi"/>
-          <w:sz w:val="21"/>
-          <w:szCs w:val="21"/>
-        </w:rPr>
-        <w:t>We offer a comprehensive suite of professional energy manag</w:t>
-      </w:r>
-      <w:r>
-        <w:rPr>
-          <w:rFonts w:asciiTheme="majorHAnsi" w:hAnsiTheme="majorHAnsi" w:cstheme="majorHAnsi"/>
-          <w:sz w:val="21"/>
-          <w:szCs w:val="21"/>
-        </w:rPr>
-        <w:t>ement services tailored to your operational scale, including:</w:t>
+        <w:t>We offer a comprehensive suite of professional energy management services tailored to your operational scale, including:</w:t>
       </w:r>
     </w:p>
     <w:p>
@@ -3748,15 +3896,7 @@
           <w:sz w:val="21"/>
           <w:szCs w:val="21"/>
         </w:rPr>
-        <w:t xml:space="preserve">: Full-scope assessments conducted by Registered Energy Auditors </w:t>
-      </w:r>
-      <w:r>
-        <w:rPr>
-          <w:rFonts w:asciiTheme="majorHAnsi" w:hAnsiTheme="majorHAnsi" w:cstheme="majorHAnsi"/>
-          <w:sz w:val="21"/>
-          <w:szCs w:val="21"/>
-        </w:rPr>
-        <w:t>(REAs).</w:t>
+        <w:t>: Full-scope assessments conducted by Registered Energy Auditors (REAs).</w:t>
       </w:r>
     </w:p>
     <w:p>
@@ -3787,6 +3927,7 @@
           <w:szCs w:val="21"/>
         </w:rPr>
       </w:pPr>
+      <w:proofErr w:type="spellStart"/>
       <w:r>
         <w:rPr>
           <w:rFonts w:asciiTheme="majorHAnsi" w:hAnsiTheme="majorHAnsi" w:cstheme="majorHAnsi"/>
@@ -3795,7 +3936,18 @@
           <w:sz w:val="21"/>
           <w:szCs w:val="21"/>
         </w:rPr>
-        <w:t>EnMS Training &amp; Establishment</w:t>
+        <w:t>EnMS</w:t>
+      </w:r>
+      <w:proofErr w:type="spellEnd"/>
+      <w:r>
+        <w:rPr>
+          <w:rFonts w:asciiTheme="majorHAnsi" w:hAnsiTheme="majorHAnsi" w:cstheme="majorHAnsi"/>
+          <w:b/>
+          <w:bCs/>
+          <w:sz w:val="21"/>
+          <w:szCs w:val="21"/>
+        </w:rPr>
+        <w:t xml:space="preserve"> Training &amp; Establishment</w:t>
       </w:r>
       <w:r>
         <w:rPr>
@@ -3850,15 +4002,7 @@
           <w:sz w:val="21"/>
           <w:szCs w:val="21"/>
         </w:rPr>
-        <w:t>: Advanced data aggregation and IoT telemetry to effortlessly ca</w:t>
-      </w:r>
-      <w:r>
-        <w:rPr>
-          <w:rFonts w:asciiTheme="majorHAnsi" w:hAnsiTheme="majorHAnsi" w:cstheme="majorHAnsi"/>
-          <w:sz w:val="21"/>
-          <w:szCs w:val="21"/>
-        </w:rPr>
-        <w:t>pture your 12-month energy baselines and continuous performance.</w:t>
+        <w:t>: Advanced data aggregation and IoT telemetry to effortlessly capture your 12-month energy baselines and continuous performance.</w:t>
       </w:r>
     </w:p>
     <w:p>
@@ -3933,34 +4077,7 @@
                 <w:color w:val="64748B"/>
                 <w:sz w:val="18"/>
               </w:rPr>
-              <w:t xml:space="preserve">Disclaimer: This report is based </w:t>
-            </w:r>
-            <w:r>
-              <w:rPr>
-                <w:rFonts w:asciiTheme="majorHAnsi" w:hAnsiTheme="majorHAnsi" w:cstheme="majorHAnsi"/>
-                <w:i/>
-                <w:color w:val="64748B"/>
-                <w:sz w:val="18"/>
-              </w:rPr>
-              <w:t>solely on the information provided through the EECA Compliance &amp; Readiness Self-Check tool. It is intended as a preliminary advisory document only and does not constitute legal confirmation of compliance status, formal regulatory determination, or professi</w:t>
-            </w:r>
-            <w:r>
-              <w:rPr>
-                <w:rFonts w:asciiTheme="majorHAnsi" w:hAnsiTheme="majorHAnsi" w:cstheme="majorHAnsi"/>
-                <w:i/>
-                <w:color w:val="64748B"/>
-                <w:sz w:val="18"/>
-              </w:rPr>
-              <w:t>onal certification under the Energy Efficiency and Conservation Act 2024. Sandhurst Advisory takes no liability for this report as it is an auto-generated self-assessment. User discretion is strictly required, and formal consultation is recommended for def</w:t>
-            </w:r>
-            <w:r>
-              <w:rPr>
-                <w:rFonts w:asciiTheme="majorHAnsi" w:hAnsiTheme="majorHAnsi" w:cstheme="majorHAnsi"/>
-                <w:i/>
-                <w:color w:val="64748B"/>
-                <w:sz w:val="18"/>
-              </w:rPr>
-              <w:t>initive compliance mapping.</w:t>
+              <w:t>Disclaimer: This report is based solely on the information provided through the EECA Compliance &amp; Readiness Self-Check tool. It is intended as a preliminary advisory document only and does not constitute legal confirmation of compliance status, formal regulatory determination, or professional certification under the Energy Efficiency and Conservation Act 2024. Sandhurst Advisory takes no liability for this report as it is an auto-generated self-assessment. User discretion is strictly required, and formal consultation is recommended for definitive compliance mapping.</w:t>
             </w:r>
           </w:p>
         </w:tc>

</xml_diff>